<commit_message>
updated Week08 Lecture13 powerpoint, added quiz 5 and week 6 exit ticket
</commit_message>
<xml_diff>
--- a/python/CourseDesign/Project1_F26/Time_Frequency_Processing_Project.docx
+++ b/python/CourseDesign/Project1_F26/Time_Frequency_Processing_Project.docx
@@ -650,15 +650,7 @@
         <w:t xml:space="preserve">and </w:t>
       </w:r>
       <w:r>
-        <w:t xml:space="preserve">a </w:t>
-      </w:r>
-      <w:proofErr w:type="gramStart"/>
-      <w:r>
-        <w:t>5 to 7 page</w:t>
-      </w:r>
-      <w:proofErr w:type="gramEnd"/>
-      <w:r>
-        <w:t xml:space="preserve"> report</w:t>
+        <w:t>a 5 to 7 page report</w:t>
       </w:r>
       <w:r>
         <w:t xml:space="preserve"> with labeled graphs</w:t>
@@ -706,23 +698,7 @@
     </w:p>
     <w:p>
       <w:r>
-        <w:t xml:space="preserve">All supplied test WAV files use 16000 samples per second. Float32 WAV files are deliberate; modern scientific readers support them. Use </w:t>
-      </w:r>
-      <w:proofErr w:type="spellStart"/>
-      <w:r>
-        <w:t>common.read_wav</w:t>
-      </w:r>
-      <w:proofErr w:type="spellEnd"/>
-      <w:r>
-        <w:t xml:space="preserve"> to handle ordinary integer PCM files and sample rate conversion. </w:t>
-      </w:r>
-      <w:proofErr w:type="gramStart"/>
-      <w:r>
-        <w:t>Compute</w:t>
-      </w:r>
-      <w:proofErr w:type="gramEnd"/>
-      <w:r>
-        <w:t xml:space="preserve"> in float64 or complex128.</w:t>
+        <w:t>All supplied test WAV files use 16000 samples per second. Float32 WAV files are deliberate; modern scientific readers support them. Use common.read_wav to handle ordinary integer PCM files and sample rate conversion. Compute in float64 or complex128.</w:t>
       </w:r>
     </w:p>
     <w:tbl>
@@ -1097,21 +1073,7 @@
               <w:rPr>
                 <w:sz w:val="20"/>
               </w:rPr>
-              <w:t xml:space="preserve">Evaluation only; never </w:t>
-            </w:r>
-            <w:proofErr w:type="gramStart"/>
-            <w:r>
-              <w:rPr>
-                <w:sz w:val="20"/>
-              </w:rPr>
-              <w:t>use</w:t>
-            </w:r>
-            <w:proofErr w:type="gramEnd"/>
-            <w:r>
-              <w:rPr>
-                <w:sz w:val="20"/>
-              </w:rPr>
-              <w:t xml:space="preserve"> to estimate the ridge</w:t>
+              <w:t>Evaluation only; never use to estimate the ridge</w:t>
             </w:r>
           </w:p>
         </w:tc>
@@ -1184,15 +1146,7 @@
     </w:p>
     <w:p>
       <w:r>
-        <w:t>signals/</w:t>
-      </w:r>
-      <w:proofErr w:type="spellStart"/>
-      <w:r>
-        <w:t>truth.npz</w:t>
-      </w:r>
-      <w:proofErr w:type="spellEnd"/>
-      <w:r>
-        <w:t xml:space="preserve"> provides evaluation references and modem metadata. You may use clean signals to calculate scores</w:t>
+        <w:t>signals/truth.npz provides evaluation references and modem metadata. You may use clean signals to calculate scores</w:t>
       </w:r>
       <w:r>
         <w:t>.</w:t>
@@ -1253,23 +1207,7 @@
     </w:p>
     <w:p>
       <w:r>
-        <w:t xml:space="preserve">L is frame </w:t>
-      </w:r>
-      <w:proofErr w:type="gramStart"/>
-      <w:r>
-        <w:t>length,</w:t>
-      </w:r>
-      <w:proofErr w:type="gramEnd"/>
-      <w:r>
-        <w:t xml:space="preserve"> H is hop and N is FFT length with N at least L. Overlap fraction is 1 minus H divided by L. Use a periodic analysis window. Store complex coefficients, original signal length and padding. Frame times use the window center; subtract the initial padding offset. For I/Q use a </w:t>
-      </w:r>
-      <w:proofErr w:type="gramStart"/>
-      <w:r>
-        <w:t>two sided</w:t>
-      </w:r>
-      <w:proofErr w:type="gramEnd"/>
-      <w:r>
-        <w:t xml:space="preserve"> FFT and retain complex samples.</w:t>
+        <w:t>L is frame length, H is hop and N is FFT length with N at least L. Overlap fraction is 1 minus H divided by L. Use a periodic analysis window. Store complex coefficients, original signal length and padding. Frame times use the window center; subtract the initial padding offset. For I/Q use a two sided FFT and retain complex samples.</w:t>
       </w:r>
     </w:p>
     <w:p>
@@ -1346,15 +1284,7 @@
     </w:p>
     <w:p>
       <w:r>
-        <w:t xml:space="preserve">Explain why long windows help distinguish close steady tones but smear short events and broaden the apparent sweep of a chirp within each frame. FFT bin spacing is not the true resolving power. At L=1024, repeat with N=4096 while keeping L and H fixed. Explain what zero padding changes and </w:t>
-      </w:r>
-      <w:proofErr w:type="gramStart"/>
-      <w:r>
-        <w:t>what it</w:t>
-      </w:r>
-      <w:proofErr w:type="gramEnd"/>
-      <w:r>
-        <w:t xml:space="preserve"> cannot change. Use the time frequency uncertainty idea qualitatively; a continuous time Gaussian bound should not be applied blindly to finite periodic DFT samples.</w:t>
+        <w:t>Explain why long windows help distinguish close steady tones but smear short events and broaden the apparent sweep of a chirp within each frame. FFT bin spacing is not the true resolving power. At L=1024, repeat with N=4096 while keeping L and H fixed. Explain what zero padding changes and what it cannot change. Use the time frequency uncertainty idea qualitatively; a continuous time Gaussian bound should not be applied blindly to finite periodic DFT samples.</w:t>
       </w:r>
     </w:p>
     <w:p>
@@ -1372,31 +1302,7 @@
     </w:p>
     <w:p>
       <w:r>
-        <w:t xml:space="preserve">Also </w:t>
-      </w:r>
-      <w:proofErr w:type="gramStart"/>
-      <w:r>
-        <w:t>compute</w:t>
-      </w:r>
-      <w:proofErr w:type="gramEnd"/>
-      <w:r>
-        <w:t xml:space="preserve"> each window </w:t>
-      </w:r>
-      <w:proofErr w:type="gramStart"/>
-      <w:r>
-        <w:t>transform</w:t>
-      </w:r>
-      <w:proofErr w:type="gramEnd"/>
-      <w:r>
-        <w:t xml:space="preserve"> alone, normalized by its DC amplitude. Measure null to null main lobe width and highest sidelobe outside the main lobe. State your numerical definition of a first null or minimum. Calculate equivalent noise bandwidth from the equation below. Do not measure sidelobe levels from the </w:t>
-      </w:r>
-      <w:proofErr w:type="gramStart"/>
-      <w:r>
-        <w:t>two tone</w:t>
-      </w:r>
-      <w:proofErr w:type="gramEnd"/>
-      <w:r>
-        <w:t xml:space="preserve"> mixture.</w:t>
+        <w:t>Also compute each window transform alone, normalized by its DC amplitude. Measure null to null main lobe width and highest sidelobe outside the main lobe. State your numerical definition of a first null or minimum. Calculate equivalent noise bandwidth from the equation below. Do not measure sidelobe levels from the two tone mixture.</w:t>
       </w:r>
     </w:p>
     <w:p>
@@ -1473,15 +1379,7 @@
     </w:p>
     <w:p>
       <w:r>
-        <w:t xml:space="preserve">Implement synthesis with IFFT, a synthesis window, overlap summation, </w:t>
-      </w:r>
-      <w:proofErr w:type="spellStart"/>
-      <w:r>
-        <w:t>samplewise</w:t>
-      </w:r>
-      <w:proofErr w:type="spellEnd"/>
-      <w:r>
-        <w:t xml:space="preserve"> normalization and exact cropping. For analysis and synthesis using the same real window, use the squared window denominator. Record the minimum and maximum denominator over retained samples.</w:t>
+        <w:t>Implement synthesis with IFFT, a synthesis window, overlap summation, samplewise normalization and exact cropping. For analysis and synthesis using the same real window, use the squared window denominator. Record the minimum and maximum denominator over retained samples.</w:t>
       </w:r>
     </w:p>
     <w:p>
@@ -1530,13 +1428,8 @@
       </w:r>
     </w:p>
     <w:p>
-      <w:proofErr w:type="gramStart"/>
       <w:r>
-        <w:t>Here v</w:t>
-      </w:r>
-      <w:proofErr w:type="gramEnd"/>
-      <w:r>
-        <w:t xml:space="preserve"> is the first L samples of the N point IFFT of a frame. An unmodified frame equals the analysis window times the input. A nonzero denominator on every retained sample is the NOLA</w:t>
+        <w:t>Here v is the first L samples of the N point IFFT of a frame. An unmodified frame equals the analysis window times the input. A nonzero denominator on every retained sample is the NOLA</w:t>
       </w:r>
       <w:r>
         <w:t xml:space="preserve"> (nonzero overlap add)</w:t>
@@ -1547,15 +1440,7 @@
     </w:p>
     <w:p>
       <w:r>
-        <w:t xml:space="preserve">Compare Hann overlaps of 0, 25, 50, 75 and 87.5 percent at L=1024. Expect zero </w:t>
-      </w:r>
-      <w:proofErr w:type="gramStart"/>
-      <w:r>
-        <w:t>overlap</w:t>
-      </w:r>
-      <w:proofErr w:type="gramEnd"/>
-      <w:r>
-        <w:t xml:space="preserve"> to fail because the Hann window has zeros; detect and explain the failure instead of dividing by zero. Show a rectangular zero overlap control. For valid cases report relative reconstruction error, frame count and measured runtime. Runtime is descriptive, not a grading threshold. Float64 identity error should be below 1e-10. Report audio WAV round trip error separately.</w:t>
+        <w:t>Compare Hann overlaps of 0, 25, 50, 75 and 87.5 percent at L=1024. Expect zero overlap to fail because the Hann window has zeros; detect and explain the failure instead of dividing by zero. Show a rectangular zero overlap control. For valid cases report relative reconstruction error, frame count and measured runtime. Runtime is descriptive, not a grading threshold. Float64 identity error should be below 1e-10. Report audio WAV round trip error separately.</w:t>
       </w:r>
     </w:p>
     <w:p>
@@ -1568,23 +1453,7 @@
     </w:p>
     <w:p>
       <w:r>
-        <w:t xml:space="preserve">Implement </w:t>
-      </w:r>
-      <w:proofErr w:type="spellStart"/>
-      <w:r>
-        <w:t>ola_filter</w:t>
-      </w:r>
-      <w:proofErr w:type="spellEnd"/>
-      <w:r>
-        <w:t xml:space="preserve"> using nonoverlapping input blocks of B=512 samples and a </w:t>
-      </w:r>
-      <w:proofErr w:type="gramStart"/>
-      <w:r>
-        <w:t>129 tap</w:t>
-      </w:r>
-      <w:proofErr w:type="gramEnd"/>
-      <w:r>
-        <w:t xml:space="preserve"> Hamming lowpass FIR with cutoff 1200 Hz. Zero pad each block, multiply its FFT by the filter FFT, inverse transform, then overlap add the full block convolution outputs. Use the supplied filter design call or an equivalent one; you are not being graded on designing an optimal lowpass.</w:t>
+        <w:t>Implement ola_filter using nonoverlapping input blocks of B=512 samples and a 129 tap Hamming lowpass FIR with cutoff 1200 Hz. Zero pad each block, multiply its FFT by the filter FFT, inverse transform, then overlap add the full block convolution outputs. Use the supplied filter design call or an equivalent one; you are not being graded on designing an optimal lowpass.</w:t>
       </w:r>
     </w:p>
     <w:p>
@@ -1634,39 +1503,10 @@
     </w:p>
     <w:p>
       <w:r>
-        <w:t xml:space="preserve">Verify the full output against </w:t>
+        <w:t xml:space="preserve">Filter the “mixture” signal (jammed.wav) with the lowpass FIR and listen to the original and the filtered signals. </w:t>
       </w:r>
-      <w:proofErr w:type="spellStart"/>
       <w:r>
-        <w:t>np.convolve</w:t>
-      </w:r>
-      <w:proofErr w:type="spellEnd"/>
-      <w:r>
-        <w:t xml:space="preserve">, including the final partial block and filter tail. Relative </w:t>
-      </w:r>
-      <w:proofErr w:type="gramStart"/>
-      <w:r>
-        <w:t>error</w:t>
-      </w:r>
-      <w:proofErr w:type="gramEnd"/>
-      <w:r>
-        <w:t xml:space="preserve"> should be below </w:t>
-      </w:r>
-      <w:proofErr w:type="gramStart"/>
-      <w:r>
-        <w:t>1e</w:t>
-      </w:r>
-      <w:proofErr w:type="gramEnd"/>
-      <w:r>
-        <w:t xml:space="preserve">-10. Explain why too short an FFT creates circular aliasing. Repeat for B=128 and 2048 and compare FFT sizes and frame counts. Account for the </w:t>
-      </w:r>
-      <w:proofErr w:type="gramStart"/>
-      <w:r>
-        <w:t>64 sample</w:t>
-      </w:r>
-      <w:proofErr w:type="gramEnd"/>
-      <w:r>
-        <w:t xml:space="preserve"> FIR group delay when making waveform comparisons. Do not apply Hann windows or squared window normalization to this exact block convolution method.</w:t>
+        <w:t>Verify the full output against np.convolve, including the final partial block and filter tail. Relative error should be below 1e-10. Explain why too short an FFT creates circular aliasing. Repeat for B=128 and 2048 and compare FFT sizes and frame counts. Account for the 64 sample FIR group delay when making waveform comparisons. Do not apply Hann windows or squared window normalization to this exact block convolution method.</w:t>
       </w:r>
     </w:p>
     <w:p>
@@ -1696,52 +1536,12 @@
     </w:p>
     <w:p>
       <w:r>
-        <w:t xml:space="preserve">Use supplied 1000 </w:t>
-      </w:r>
-      <w:proofErr w:type="gramStart"/>
-      <w:r>
-        <w:t>symbol</w:t>
-      </w:r>
-      <w:proofErr w:type="gramEnd"/>
-      <w:r>
-        <w:t xml:space="preserve"> per second QPSK, 16 samples per symbol, root raised cosine pulses with </w:t>
-      </w:r>
-      <w:proofErr w:type="spellStart"/>
-      <w:r>
-        <w:t>rolloff</w:t>
-      </w:r>
-      <w:proofErr w:type="spellEnd"/>
-      <w:r>
-        <w:t xml:space="preserve"> 0.35 and a </w:t>
-      </w:r>
-      <w:proofErr w:type="gramStart"/>
-      <w:r>
-        <w:t>10 symbol</w:t>
-      </w:r>
-      <w:proofErr w:type="gramEnd"/>
-      <w:r>
-        <w:t xml:space="preserve"> span. Reassemble the full I/Q signal with the unchanged STFT, then pass it to the supplied matched receiver. Compare waveform error, EVM, BER and constellation plots for the original and reconstructed signals.</w:t>
+        <w:t>Use supplied 1000 symbol per second QPSK, 16 samples per symbol, root raised cosine pulses with rolloff 0.35 and a 10 symbol span. Reassemble the full I/Q signal with the unchanged STFT, then pass it to the supplied matched receiver. Compare waveform error, EVM, BER and constellation plots for the original and reconstructed signals.</w:t>
       </w:r>
     </w:p>
     <w:p>
       <w:r>
-        <w:t xml:space="preserve">Repeat with two deliberately broken methods: replace every STFT coefficient by its </w:t>
-      </w:r>
-      <w:proofErr w:type="gramStart"/>
-      <w:r>
-        <w:t>magnitude, and</w:t>
-      </w:r>
-      <w:proofErr w:type="gramEnd"/>
-      <w:r>
-        <w:t xml:space="preserve"> multiply each frame by an independently chosen random phase. No per frame gain normalization or phase correction is allowed. Keep the known timing and supplied matched filter. Explain why an attractive spectrogram does not demonstrate successful QPSK reconstruction. Coherent BER should be </w:t>
-      </w:r>
-      <w:proofErr w:type="gramStart"/>
-      <w:r>
-        <w:t>zero</w:t>
-      </w:r>
-      <w:proofErr w:type="gramEnd"/>
-      <w:r>
-        <w:t xml:space="preserve"> and EVM should match the original baseline; finite pulse truncation can give a small nonzero baseline EVM.</w:t>
+        <w:t>Repeat with two deliberately broken methods: replace every STFT coefficient by its magnitude, and multiply each frame by an independently chosen random phase. No per frame gain normalization or phase correction is allowed. Keep the known timing and supplied matched filter. Explain why an attractive spectrogram does not demonstrate successful QPSK reconstruction. Coherent BER should be zero and EVM should match the original baseline; finite pulse truncation can give a small nonzero baseline EVM.</w:t>
       </w:r>
     </w:p>
     <w:p>
@@ -2422,15 +2222,7 @@
     </w:p>
     <w:p>
       <w:r>
-        <w:t xml:space="preserve">For graduate students, require a </w:t>
-      </w:r>
-      <w:proofErr w:type="gramStart"/>
-      <w:r>
-        <w:t>one page</w:t>
-      </w:r>
-      <w:proofErr w:type="gramEnd"/>
-      <w:r>
-        <w:t xml:space="preserve"> deeper analysis within the same </w:t>
+        <w:t xml:space="preserve">For graduate students, require a one page deeper analysis within the same </w:t>
       </w:r>
       <w:r>
         <w:t>grading</w:t>

</xml_diff>